<commit_message>
user profile, activity list, research folder
</commit_message>
<xml_diff>
--- a/Group2CMSC4900Proposal.docx
+++ b/Group2CMSC4900Proposal.docx
@@ -459,21 +459,7 @@
         <w:rPr>
           <w:rFonts w:ascii="Arial" w:hAnsi="Arial" w:cs="Arial"/>
         </w:rPr>
-        <w:t xml:space="preserve"> a database and artificial intelligence analysis </w:t>
-      </w:r>
-      <w:proofErr w:type="gramStart"/>
-      <w:r>
-        <w:rPr>
-          <w:rFonts w:ascii="Arial" w:hAnsi="Arial" w:cs="Arial"/>
-        </w:rPr>
-        <w:t>in order to</w:t>
-      </w:r>
-      <w:proofErr w:type="gramEnd"/>
-      <w:r>
-        <w:rPr>
-          <w:rFonts w:ascii="Arial" w:hAnsi="Arial" w:cs="Arial"/>
-        </w:rPr>
-        <w:t xml:space="preserve"> encourage students to maintain a healthy lifestyle through healthy competition by uploading activities that they have completed into one platform. </w:t>
+        <w:t xml:space="preserve"> a database and artificial intelligence analysis in order to encourage students to maintain a healthy lifestyle through healthy competition by uploading activities that they have completed into one platform. </w:t>
       </w:r>
     </w:p>
     <w:p>
@@ -843,35 +829,7 @@
         <w:rPr>
           <w:rFonts w:ascii="Arial" w:hAnsi="Arial" w:cs="Arial"/>
         </w:rPr>
-        <w:t xml:space="preserve">HTML and CSS will be used for our frontend framework of this web-based application. We will make use of base templates </w:t>
-      </w:r>
-      <w:proofErr w:type="gramStart"/>
-      <w:r>
-        <w:rPr>
-          <w:rFonts w:ascii="Arial" w:hAnsi="Arial" w:cs="Arial"/>
-        </w:rPr>
-        <w:t>in order to</w:t>
-      </w:r>
-      <w:proofErr w:type="gramEnd"/>
-      <w:r>
-        <w:rPr>
-          <w:rFonts w:ascii="Arial" w:hAnsi="Arial" w:cs="Arial"/>
-        </w:rPr>
-        <w:t xml:space="preserve"> reduce </w:t>
-      </w:r>
-      <w:proofErr w:type="gramStart"/>
-      <w:r>
-        <w:rPr>
-          <w:rFonts w:ascii="Arial" w:hAnsi="Arial" w:cs="Arial"/>
-        </w:rPr>
-        <w:t>all of</w:t>
-      </w:r>
-      <w:proofErr w:type="gramEnd"/>
-      <w:r>
-        <w:rPr>
-          <w:rFonts w:ascii="Arial" w:hAnsi="Arial" w:cs="Arial"/>
-        </w:rPr>
-        <w:t xml:space="preserve"> the code to one place and to make routing to another page easier. CSS will be used for the style of the website</w:t>
+        <w:t>HTML and CSS will be used for our frontend framework of this web-based application. We will make use of base templates in order to reduce all of the code to one place and to make routing to another page easier. CSS will be used for the style of the website</w:t>
       </w:r>
     </w:p>
     <w:p>
@@ -931,35 +889,7 @@
         <w:rPr>
           <w:rFonts w:ascii="Arial" w:hAnsi="Arial" w:cs="Arial"/>
         </w:rPr>
-        <w:t xml:space="preserve">We will make use of API calls </w:t>
-      </w:r>
-      <w:proofErr w:type="gramStart"/>
-      <w:r>
-        <w:rPr>
-          <w:rFonts w:ascii="Arial" w:hAnsi="Arial" w:cs="Arial"/>
-        </w:rPr>
-        <w:t>in order to</w:t>
-      </w:r>
-      <w:proofErr w:type="gramEnd"/>
-      <w:r>
-        <w:rPr>
-          <w:rFonts w:ascii="Arial" w:hAnsi="Arial" w:cs="Arial"/>
-        </w:rPr>
-        <w:t xml:space="preserve"> enable our AI coach (more on that in Features). We will also make use of API calls </w:t>
-      </w:r>
-      <w:proofErr w:type="gramStart"/>
-      <w:r>
-        <w:rPr>
-          <w:rFonts w:ascii="Arial" w:hAnsi="Arial" w:cs="Arial"/>
-        </w:rPr>
-        <w:t>in order to</w:t>
-      </w:r>
-      <w:proofErr w:type="gramEnd"/>
-      <w:r>
-        <w:rPr>
-          <w:rFonts w:ascii="Arial" w:hAnsi="Arial" w:cs="Arial"/>
-        </w:rPr>
-        <w:t xml:space="preserve"> display the information that the user wants to see based on filters, searches, organizations, etc. </w:t>
+        <w:t xml:space="preserve">We will make use of API calls in order to enable our AI coach (more on that in Features). We will also make use of API calls in order to display the information that the user wants to see based on filters, searches, organizations, etc. </w:t>
       </w:r>
     </w:p>
     <w:p>
@@ -1008,12 +938,31 @@
           <w:szCs w:val="32"/>
         </w:rPr>
       </w:pPr>
-      <w:r>
-        <w:rPr>
-          <w:rFonts w:ascii="Arial" w:hAnsi="Arial" w:cs="Arial"/>
-          <w:sz w:val="32"/>
-          <w:szCs w:val="32"/>
-        </w:rPr>
+    </w:p>
+    <w:p>
+      <w:pPr>
+        <w:rPr>
+          <w:rFonts w:ascii="Arial" w:hAnsi="Arial" w:cs="Arial"/>
+          <w:sz w:val="32"/>
+          <w:szCs w:val="32"/>
+        </w:rPr>
+      </w:pPr>
+    </w:p>
+    <w:p>
+      <w:pPr>
+        <w:rPr>
+          <w:rFonts w:ascii="Arial" w:hAnsi="Arial" w:cs="Arial"/>
+          <w:sz w:val="32"/>
+          <w:szCs w:val="32"/>
+        </w:rPr>
+      </w:pPr>
+      <w:r>
+        <w:rPr>
+          <w:rFonts w:ascii="Arial" w:hAnsi="Arial" w:cs="Arial"/>
+          <w:sz w:val="32"/>
+          <w:szCs w:val="32"/>
+        </w:rPr>
+        <w:lastRenderedPageBreak/>
         <w:t>Features</w:t>
       </w:r>
     </w:p>
@@ -1029,7 +978,6 @@
           <w:sz w:val="32"/>
           <w:szCs w:val="32"/>
         </w:rPr>
-        <w:lastRenderedPageBreak/>
         <w:tab/>
       </w:r>
       <w:r>
@@ -1100,6 +1048,221 @@
         </w:rPr>
         <w:t xml:space="preserve">– the program will have a feature that will allow a user to select the route they took if their activity was outdoors. There will be a list of available routes along with their mileage. Users can select how many times they did the route, or if they did a second route within the activity (an example would be going into the rotary park loop and then coming back out). </w:t>
       </w:r>
+    </w:p>
+    <w:p>
+      <w:pPr>
+        <w:ind w:firstLine="720"/>
+        <w:rPr>
+          <w:rFonts w:ascii="Arial" w:hAnsi="Arial" w:cs="Arial"/>
+        </w:rPr>
+      </w:pPr>
+      <w:r>
+        <w:rPr>
+          <w:rFonts w:ascii="Arial" w:hAnsi="Arial" w:cs="Arial"/>
+          <w:sz w:val="28"/>
+          <w:szCs w:val="28"/>
+        </w:rPr>
+        <w:t xml:space="preserve">Activity List – </w:t>
+      </w:r>
+      <w:r>
+        <w:rPr>
+          <w:rFonts w:ascii="Arial" w:hAnsi="Arial" w:cs="Arial"/>
+        </w:rPr>
+        <w:t xml:space="preserve">the </w:t>
+      </w:r>
+      <w:r>
+        <w:rPr>
+          <w:rFonts w:ascii="Arial" w:hAnsi="Arial" w:cs="Arial"/>
+        </w:rPr>
+        <w:t xml:space="preserve">application will have an activity list that will allow users to choose </w:t>
+      </w:r>
+      <w:r>
+        <w:rPr>
+          <w:rFonts w:ascii="Arial" w:hAnsi="Arial" w:cs="Arial"/>
+        </w:rPr>
+        <w:t>and record exercise.</w:t>
+      </w:r>
+      <w:r>
+        <w:rPr>
+          <w:rFonts w:ascii="Arial" w:hAnsi="Arial" w:cs="Arial"/>
+        </w:rPr>
+        <w:t xml:space="preserve"> </w:t>
+      </w:r>
+      <w:r>
+        <w:rPr>
+          <w:rFonts w:ascii="Arial" w:hAnsi="Arial" w:cs="Arial"/>
+        </w:rPr>
+        <w:t xml:space="preserve">These activities will include </w:t>
+      </w:r>
+      <w:r>
+        <w:rPr>
+          <w:rFonts w:ascii="Arial" w:hAnsi="Arial" w:cs="Arial"/>
+        </w:rPr>
+        <w:t>running, biking, walking, strength, all sports, yoga, stretching</w:t>
+      </w:r>
+      <w:r>
+        <w:rPr>
+          <w:rFonts w:ascii="Arial" w:hAnsi="Arial" w:cs="Arial"/>
+        </w:rPr>
+        <w:t xml:space="preserve">. </w:t>
+      </w:r>
+      <w:r>
+        <w:rPr>
+          <w:rFonts w:ascii="Arial" w:hAnsi="Arial" w:cs="Arial"/>
+        </w:rPr>
+        <w:t>The activity list will also have the option of recording a custom activity.</w:t>
+      </w:r>
+      <w:r>
+        <w:rPr>
+          <w:rFonts w:ascii="Arial" w:hAnsi="Arial" w:cs="Arial"/>
+        </w:rPr>
+        <w:t xml:space="preserve"> </w:t>
+      </w:r>
+      <w:r>
+        <w:rPr>
+          <w:rFonts w:ascii="Arial" w:hAnsi="Arial" w:cs="Arial"/>
+        </w:rPr>
+        <w:t>It will display what activities are group</w:t>
+      </w:r>
+      <w:r>
+        <w:rPr>
+          <w:rFonts w:ascii="Arial" w:hAnsi="Arial" w:cs="Arial"/>
+        </w:rPr>
+        <w:t xml:space="preserve"> or </w:t>
+      </w:r>
+      <w:r>
+        <w:rPr>
+          <w:rFonts w:ascii="Arial" w:hAnsi="Arial" w:cs="Arial"/>
+        </w:rPr>
+        <w:t>popular</w:t>
+      </w:r>
+      <w:r>
+        <w:rPr>
+          <w:rFonts w:ascii="Arial" w:hAnsi="Arial" w:cs="Arial"/>
+        </w:rPr>
+        <w:t>.</w:t>
+      </w:r>
+    </w:p>
+    <w:p>
+      <w:pPr>
+        <w:ind w:firstLine="720"/>
+        <w:rPr>
+          <w:rFonts w:ascii="Arial" w:hAnsi="Arial" w:cs="Arial"/>
+        </w:rPr>
+      </w:pPr>
+      <w:r>
+        <w:rPr>
+          <w:rFonts w:ascii="Arial" w:hAnsi="Arial" w:cs="Arial"/>
+          <w:sz w:val="28"/>
+          <w:szCs w:val="28"/>
+        </w:rPr>
+        <w:t xml:space="preserve">User Profile </w:t>
+      </w:r>
+      <w:r>
+        <w:rPr>
+          <w:rFonts w:ascii="Arial" w:hAnsi="Arial" w:cs="Arial"/>
+          <w:sz w:val="28"/>
+          <w:szCs w:val="28"/>
+        </w:rPr>
+        <w:t>–</w:t>
+      </w:r>
+      <w:r>
+        <w:rPr>
+          <w:rFonts w:ascii="Arial" w:hAnsi="Arial" w:cs="Arial"/>
+          <w:sz w:val="28"/>
+          <w:szCs w:val="28"/>
+        </w:rPr>
+        <w:t xml:space="preserve"> </w:t>
+      </w:r>
+      <w:r>
+        <w:rPr>
+          <w:rFonts w:ascii="Arial" w:hAnsi="Arial" w:cs="Arial"/>
+        </w:rPr>
+        <w:t>I</w:t>
+      </w:r>
+      <w:r>
+        <w:rPr>
+          <w:rFonts w:ascii="Arial" w:hAnsi="Arial" w:cs="Arial"/>
+        </w:rPr>
+        <w:t xml:space="preserve">n the </w:t>
+      </w:r>
+      <w:r>
+        <w:rPr>
+          <w:rFonts w:ascii="Arial" w:hAnsi="Arial" w:cs="Arial"/>
+        </w:rPr>
+        <w:t>user profile feature</w:t>
+      </w:r>
+      <w:r>
+        <w:rPr>
+          <w:rFonts w:ascii="Arial" w:hAnsi="Arial" w:cs="Arial"/>
+        </w:rPr>
+        <w:t xml:space="preserve">, users will be able to manage their activities of creating a workout </w:t>
+      </w:r>
+      <w:r>
+        <w:rPr>
+          <w:rFonts w:ascii="Arial" w:hAnsi="Arial" w:cs="Arial"/>
+        </w:rPr>
+        <w:t xml:space="preserve">and adding other users to a group activity. </w:t>
+      </w:r>
+      <w:r>
+        <w:rPr>
+          <w:rFonts w:ascii="Arial" w:hAnsi="Arial" w:cs="Arial"/>
+        </w:rPr>
+        <w:t xml:space="preserve">Users will be able to </w:t>
+      </w:r>
+      <w:r>
+        <w:rPr>
+          <w:rFonts w:ascii="Arial" w:hAnsi="Arial" w:cs="Arial"/>
+        </w:rPr>
+        <w:t xml:space="preserve">log </w:t>
+      </w:r>
+      <w:r>
+        <w:rPr>
+          <w:rFonts w:ascii="Arial" w:hAnsi="Arial" w:cs="Arial"/>
+        </w:rPr>
+        <w:t>statistics</w:t>
+      </w:r>
+      <w:r>
+        <w:rPr>
+          <w:rFonts w:ascii="Arial" w:hAnsi="Arial" w:cs="Arial"/>
+        </w:rPr>
+        <w:t xml:space="preserve"> about their chosen activities </w:t>
+      </w:r>
+      <w:r>
+        <w:rPr>
+          <w:rFonts w:ascii="Arial" w:hAnsi="Arial" w:cs="Arial"/>
+        </w:rPr>
+        <w:t xml:space="preserve">and view past recorded activities. </w:t>
+      </w:r>
+      <w:r>
+        <w:rPr>
+          <w:rFonts w:ascii="Arial" w:hAnsi="Arial" w:cs="Arial"/>
+        </w:rPr>
+        <w:t xml:space="preserve">Users will be able to filter their activities by </w:t>
+      </w:r>
+      <w:r>
+        <w:rPr>
+          <w:rFonts w:ascii="Arial" w:hAnsi="Arial" w:cs="Arial"/>
+        </w:rPr>
+        <w:t>year and category.</w:t>
+      </w:r>
+    </w:p>
+    <w:p>
+      <w:pPr>
+        <w:ind w:firstLine="720"/>
+        <w:rPr>
+          <w:rFonts w:ascii="Arial" w:hAnsi="Arial" w:cs="Arial"/>
+          <w:sz w:val="28"/>
+          <w:szCs w:val="28"/>
+        </w:rPr>
+      </w:pPr>
+    </w:p>
+    <w:p>
+      <w:pPr>
+        <w:rPr>
+          <w:rFonts w:ascii="Arial" w:hAnsi="Arial" w:cs="Arial"/>
+        </w:rPr>
+      </w:pPr>
     </w:p>
     <w:p>
       <w:pPr>
@@ -1235,6 +1398,119 @@
     </w:lvl>
   </w:abstractNum>
   <w:abstractNum w:abstractNumId="1" w15:restartNumberingAfterBreak="0">
+    <w:nsid w:val="6C327E73"/>
+    <w:multiLevelType w:val="hybridMultilevel"/>
+    <w:tmpl w:val="C4EE9AAC"/>
+    <w:lvl w:ilvl="0" w:tplc="04090001">
+      <w:start w:val="1"/>
+      <w:numFmt w:val="bullet"/>
+      <w:lvlText w:val=""/>
+      <w:lvlJc w:val="left"/>
+      <w:pPr>
+        <w:ind w:left="720" w:hanging="360"/>
+      </w:pPr>
+      <w:rPr>
+        <w:rFonts w:ascii="Symbol" w:hAnsi="Symbol" w:hint="default"/>
+      </w:rPr>
+    </w:lvl>
+    <w:lvl w:ilvl="1" w:tplc="04090003">
+      <w:start w:val="1"/>
+      <w:numFmt w:val="bullet"/>
+      <w:lvlText w:val="o"/>
+      <w:lvlJc w:val="left"/>
+      <w:pPr>
+        <w:ind w:left="1440" w:hanging="360"/>
+      </w:pPr>
+      <w:rPr>
+        <w:rFonts w:ascii="Courier New" w:hAnsi="Courier New" w:cs="Courier New" w:hint="default"/>
+      </w:rPr>
+    </w:lvl>
+    <w:lvl w:ilvl="2" w:tplc="04090005">
+      <w:start w:val="1"/>
+      <w:numFmt w:val="bullet"/>
+      <w:lvlText w:val=""/>
+      <w:lvlJc w:val="left"/>
+      <w:pPr>
+        <w:ind w:left="2160" w:hanging="360"/>
+      </w:pPr>
+      <w:rPr>
+        <w:rFonts w:ascii="Wingdings" w:hAnsi="Wingdings" w:hint="default"/>
+      </w:rPr>
+    </w:lvl>
+    <w:lvl w:ilvl="3" w:tplc="04090001" w:tentative="1">
+      <w:start w:val="1"/>
+      <w:numFmt w:val="bullet"/>
+      <w:lvlText w:val=""/>
+      <w:lvlJc w:val="left"/>
+      <w:pPr>
+        <w:ind w:left="2880" w:hanging="360"/>
+      </w:pPr>
+      <w:rPr>
+        <w:rFonts w:ascii="Symbol" w:hAnsi="Symbol" w:hint="default"/>
+      </w:rPr>
+    </w:lvl>
+    <w:lvl w:ilvl="4" w:tplc="04090003" w:tentative="1">
+      <w:start w:val="1"/>
+      <w:numFmt w:val="bullet"/>
+      <w:lvlText w:val="o"/>
+      <w:lvlJc w:val="left"/>
+      <w:pPr>
+        <w:ind w:left="3600" w:hanging="360"/>
+      </w:pPr>
+      <w:rPr>
+        <w:rFonts w:ascii="Courier New" w:hAnsi="Courier New" w:cs="Courier New" w:hint="default"/>
+      </w:rPr>
+    </w:lvl>
+    <w:lvl w:ilvl="5" w:tplc="04090005" w:tentative="1">
+      <w:start w:val="1"/>
+      <w:numFmt w:val="bullet"/>
+      <w:lvlText w:val=""/>
+      <w:lvlJc w:val="left"/>
+      <w:pPr>
+        <w:ind w:left="4320" w:hanging="360"/>
+      </w:pPr>
+      <w:rPr>
+        <w:rFonts w:ascii="Wingdings" w:hAnsi="Wingdings" w:hint="default"/>
+      </w:rPr>
+    </w:lvl>
+    <w:lvl w:ilvl="6" w:tplc="04090001" w:tentative="1">
+      <w:start w:val="1"/>
+      <w:numFmt w:val="bullet"/>
+      <w:lvlText w:val=""/>
+      <w:lvlJc w:val="left"/>
+      <w:pPr>
+        <w:ind w:left="5040" w:hanging="360"/>
+      </w:pPr>
+      <w:rPr>
+        <w:rFonts w:ascii="Symbol" w:hAnsi="Symbol" w:hint="default"/>
+      </w:rPr>
+    </w:lvl>
+    <w:lvl w:ilvl="7" w:tplc="04090003" w:tentative="1">
+      <w:start w:val="1"/>
+      <w:numFmt w:val="bullet"/>
+      <w:lvlText w:val="o"/>
+      <w:lvlJc w:val="left"/>
+      <w:pPr>
+        <w:ind w:left="5760" w:hanging="360"/>
+      </w:pPr>
+      <w:rPr>
+        <w:rFonts w:ascii="Courier New" w:hAnsi="Courier New" w:cs="Courier New" w:hint="default"/>
+      </w:rPr>
+    </w:lvl>
+    <w:lvl w:ilvl="8" w:tplc="04090005" w:tentative="1">
+      <w:start w:val="1"/>
+      <w:numFmt w:val="bullet"/>
+      <w:lvlText w:val=""/>
+      <w:lvlJc w:val="left"/>
+      <w:pPr>
+        <w:ind w:left="6480" w:hanging="360"/>
+      </w:pPr>
+      <w:rPr>
+        <w:rFonts w:ascii="Wingdings" w:hAnsi="Wingdings" w:hint="default"/>
+      </w:rPr>
+    </w:lvl>
+  </w:abstractNum>
+  <w:abstractNum w:abstractNumId="2" w15:restartNumberingAfterBreak="0">
     <w:nsid w:val="6E2D0F69"/>
     <w:multiLevelType w:val="hybridMultilevel"/>
     <w:tmpl w:val="037641EC"/>
@@ -1324,10 +1600,13 @@
     </w:lvl>
   </w:abstractNum>
   <w:num w:numId="1" w16cid:durableId="526409774">
-    <w:abstractNumId w:val="1"/>
+    <w:abstractNumId w:val="2"/>
   </w:num>
   <w:num w:numId="2" w16cid:durableId="304509475">
     <w:abstractNumId w:val="0"/>
+  </w:num>
+  <w:num w:numId="3" w16cid:durableId="695809430">
+    <w:abstractNumId w:val="1"/>
   </w:num>
 </w:numbering>
 </file>

</xml_diff>

<commit_message>
add strava citation and research
</commit_message>
<xml_diff>
--- a/Group2CMSC4900Proposal.docx
+++ b/Group2CMSC4900Proposal.docx
@@ -50,7 +50,7 @@
                     <pic:cNvPicPr/>
                   </pic:nvPicPr>
                   <pic:blipFill>
-                    <a:blip r:embed="rId6">
+                    <a:blip r:embed="rId8">
                       <a:extLst>
                         <a:ext uri="{28A0092B-C50C-407E-A947-70E740481C1C}">
                           <a14:useLocalDpi xmlns:a14="http://schemas.microsoft.com/office/drawing/2010/main" val="0"/>
@@ -459,7 +459,21 @@
         <w:rPr>
           <w:rFonts w:ascii="Arial" w:hAnsi="Arial" w:cs="Arial"/>
         </w:rPr>
-        <w:t xml:space="preserve"> a database and artificial intelligence analysis in order to encourage students to maintain a healthy lifestyle through healthy competition by uploading activities that they have completed into one platform. </w:t>
+        <w:t xml:space="preserve"> a database and artificial intelligence analysis </w:t>
+      </w:r>
+      <w:proofErr w:type="gramStart"/>
+      <w:r>
+        <w:rPr>
+          <w:rFonts w:ascii="Arial" w:hAnsi="Arial" w:cs="Arial"/>
+        </w:rPr>
+        <w:t>in order to</w:t>
+      </w:r>
+      <w:proofErr w:type="gramEnd"/>
+      <w:r>
+        <w:rPr>
+          <w:rFonts w:ascii="Arial" w:hAnsi="Arial" w:cs="Arial"/>
+        </w:rPr>
+        <w:t xml:space="preserve"> encourage students to maintain a healthy lifestyle through healthy competition by uploading activities that they have completed into one platform. </w:t>
       </w:r>
     </w:p>
     <w:p>
@@ -557,7 +571,21 @@
         <w:rPr>
           <w:rFonts w:ascii="Arial" w:hAnsi="Arial" w:cs="Arial"/>
         </w:rPr>
-        <w:t>A working database is crucial in this program as the user will be entering activities into the application and all the details of this activity need to be stored accordingly. Not only this, but the user will be able to view other people’s activities.</w:t>
+        <w:t xml:space="preserve">A working database is crucial in this program as the user will be entering activities into the </w:t>
+      </w:r>
+      <w:proofErr w:type="gramStart"/>
+      <w:r>
+        <w:rPr>
+          <w:rFonts w:ascii="Arial" w:hAnsi="Arial" w:cs="Arial"/>
+        </w:rPr>
+        <w:t>application</w:t>
+      </w:r>
+      <w:proofErr w:type="gramEnd"/>
+      <w:r>
+        <w:rPr>
+          <w:rFonts w:ascii="Arial" w:hAnsi="Arial" w:cs="Arial"/>
+        </w:rPr>
+        <w:t xml:space="preserve"> and all the details of this activity need to be stored accordingly. Not only this, but the user will be able to view other people’s activities.</w:t>
       </w:r>
     </w:p>
     <w:p>
@@ -829,7 +857,49 @@
         <w:rPr>
           <w:rFonts w:ascii="Arial" w:hAnsi="Arial" w:cs="Arial"/>
         </w:rPr>
-        <w:t>HTML and CSS will be used for our frontend framework of this web-based application. We will make use of base templates in order to reduce all of the code to one place and to make routing to another page easier. CSS will be used for the style of the website</w:t>
+        <w:t xml:space="preserve">HTML and CSS will be used for our </w:t>
+      </w:r>
+      <w:proofErr w:type="gramStart"/>
+      <w:r>
+        <w:rPr>
+          <w:rFonts w:ascii="Arial" w:hAnsi="Arial" w:cs="Arial"/>
+        </w:rPr>
+        <w:t>frontend</w:t>
+      </w:r>
+      <w:proofErr w:type="gramEnd"/>
+      <w:r>
+        <w:rPr>
+          <w:rFonts w:ascii="Arial" w:hAnsi="Arial" w:cs="Arial"/>
+        </w:rPr>
+        <w:t xml:space="preserve"> framework of this web-based application. We will make use of base templates </w:t>
+      </w:r>
+      <w:proofErr w:type="gramStart"/>
+      <w:r>
+        <w:rPr>
+          <w:rFonts w:ascii="Arial" w:hAnsi="Arial" w:cs="Arial"/>
+        </w:rPr>
+        <w:t>in order to</w:t>
+      </w:r>
+      <w:proofErr w:type="gramEnd"/>
+      <w:r>
+        <w:rPr>
+          <w:rFonts w:ascii="Arial" w:hAnsi="Arial" w:cs="Arial"/>
+        </w:rPr>
+        <w:t xml:space="preserve"> reduce </w:t>
+      </w:r>
+      <w:proofErr w:type="gramStart"/>
+      <w:r>
+        <w:rPr>
+          <w:rFonts w:ascii="Arial" w:hAnsi="Arial" w:cs="Arial"/>
+        </w:rPr>
+        <w:t>all of</w:t>
+      </w:r>
+      <w:proofErr w:type="gramEnd"/>
+      <w:r>
+        <w:rPr>
+          <w:rFonts w:ascii="Arial" w:hAnsi="Arial" w:cs="Arial"/>
+        </w:rPr>
+        <w:t xml:space="preserve"> the code to one place and to make routing to another page easier. CSS will be used for the style of the website</w:t>
       </w:r>
     </w:p>
     <w:p>
@@ -889,7 +959,35 @@
         <w:rPr>
           <w:rFonts w:ascii="Arial" w:hAnsi="Arial" w:cs="Arial"/>
         </w:rPr>
-        <w:t xml:space="preserve">We will make use of API calls in order to enable our AI coach (more on that in Features). We will also make use of API calls in order to display the information that the user wants to see based on filters, searches, organizations, etc. </w:t>
+        <w:t xml:space="preserve">We will make use of API calls </w:t>
+      </w:r>
+      <w:proofErr w:type="gramStart"/>
+      <w:r>
+        <w:rPr>
+          <w:rFonts w:ascii="Arial" w:hAnsi="Arial" w:cs="Arial"/>
+        </w:rPr>
+        <w:t>in order to</w:t>
+      </w:r>
+      <w:proofErr w:type="gramEnd"/>
+      <w:r>
+        <w:rPr>
+          <w:rFonts w:ascii="Arial" w:hAnsi="Arial" w:cs="Arial"/>
+        </w:rPr>
+        <w:t xml:space="preserve"> enable our AI coach (more on that in Features). We will also make use of API calls </w:t>
+      </w:r>
+      <w:proofErr w:type="gramStart"/>
+      <w:r>
+        <w:rPr>
+          <w:rFonts w:ascii="Arial" w:hAnsi="Arial" w:cs="Arial"/>
+        </w:rPr>
+        <w:t>in order to</w:t>
+      </w:r>
+      <w:proofErr w:type="gramEnd"/>
+      <w:r>
+        <w:rPr>
+          <w:rFonts w:ascii="Arial" w:hAnsi="Arial" w:cs="Arial"/>
+        </w:rPr>
+        <w:t xml:space="preserve"> display the information that the user wants to see based on filters, searches, organizations, etc. </w:t>
       </w:r>
     </w:p>
     <w:p>
@@ -1245,6 +1343,352 @@
           <w:rFonts w:ascii="Arial" w:hAnsi="Arial" w:cs="Arial"/>
         </w:rPr>
         <w:t>year and category.</w:t>
+      </w:r>
+    </w:p>
+    <w:p>
+      <w:pPr>
+        <w:ind w:firstLine="720"/>
+        <w:rPr>
+          <w:rFonts w:ascii="Arial" w:hAnsi="Arial" w:cs="Arial"/>
+        </w:rPr>
+      </w:pPr>
+    </w:p>
+    <w:p>
+      <w:pPr>
+        <w:ind w:firstLine="720"/>
+        <w:rPr>
+          <w:rFonts w:ascii="Arial" w:hAnsi="Arial" w:cs="Arial"/>
+        </w:rPr>
+      </w:pPr>
+    </w:p>
+    <w:p>
+      <w:pPr>
+        <w:ind w:firstLine="720"/>
+        <w:rPr>
+          <w:rFonts w:ascii="Arial" w:hAnsi="Arial" w:cs="Arial"/>
+        </w:rPr>
+      </w:pPr>
+    </w:p>
+    <w:p>
+      <w:pPr>
+        <w:ind w:firstLine="720"/>
+        <w:rPr>
+          <w:rFonts w:ascii="Arial" w:hAnsi="Arial" w:cs="Arial"/>
+        </w:rPr>
+      </w:pPr>
+    </w:p>
+    <w:p>
+      <w:pPr>
+        <w:ind w:firstLine="720"/>
+        <w:rPr>
+          <w:rFonts w:ascii="Arial" w:hAnsi="Arial" w:cs="Arial"/>
+        </w:rPr>
+      </w:pPr>
+    </w:p>
+    <w:p>
+      <w:pPr>
+        <w:ind w:firstLine="720"/>
+        <w:rPr>
+          <w:rFonts w:ascii="Arial" w:hAnsi="Arial" w:cs="Arial"/>
+        </w:rPr>
+      </w:pPr>
+    </w:p>
+    <w:p>
+      <w:pPr>
+        <w:ind w:firstLine="720"/>
+        <w:rPr>
+          <w:rFonts w:ascii="Arial" w:hAnsi="Arial" w:cs="Arial"/>
+        </w:rPr>
+      </w:pPr>
+    </w:p>
+    <w:p>
+      <w:pPr>
+        <w:ind w:firstLine="720"/>
+        <w:rPr>
+          <w:rFonts w:ascii="Arial" w:hAnsi="Arial" w:cs="Arial"/>
+        </w:rPr>
+      </w:pPr>
+    </w:p>
+    <w:p>
+      <w:pPr>
+        <w:ind w:firstLine="720"/>
+        <w:rPr>
+          <w:rFonts w:ascii="Arial" w:hAnsi="Arial" w:cs="Arial"/>
+        </w:rPr>
+      </w:pPr>
+    </w:p>
+    <w:p>
+      <w:pPr>
+        <w:ind w:firstLine="720"/>
+        <w:rPr>
+          <w:rFonts w:ascii="Arial" w:hAnsi="Arial" w:cs="Arial"/>
+        </w:rPr>
+      </w:pPr>
+    </w:p>
+    <w:p>
+      <w:pPr>
+        <w:jc w:val="center"/>
+        <w:rPr>
+          <w:rFonts w:ascii="Arial" w:hAnsi="Arial" w:cs="Arial"/>
+          <w:b/>
+          <w:bCs/>
+          <w:i/>
+          <w:iCs/>
+          <w:sz w:val="28"/>
+          <w:szCs w:val="28"/>
+          <w:u w:val="single" w:color="C00000"/>
+        </w:rPr>
+      </w:pPr>
+      <w:r>
+        <w:rPr>
+          <w:rFonts w:ascii="Arial" w:hAnsi="Arial" w:cs="Arial"/>
+          <w:b/>
+          <w:bCs/>
+          <w:i/>
+          <w:iCs/>
+          <w:sz w:val="28"/>
+          <w:szCs w:val="28"/>
+          <w:u w:val="single" w:color="C00000"/>
+        </w:rPr>
+        <w:lastRenderedPageBreak/>
+        <w:t>Resources</w:t>
+      </w:r>
+    </w:p>
+    <w:p>
+      <w:pPr>
+        <w:jc w:val="center"/>
+        <w:rPr>
+          <w:rFonts w:ascii="Arial" w:hAnsi="Arial" w:cs="Arial"/>
+          <w:b/>
+          <w:bCs/>
+          <w:i/>
+          <w:iCs/>
+          <w:sz w:val="28"/>
+          <w:szCs w:val="28"/>
+          <w:u w:val="single" w:color="C00000"/>
+        </w:rPr>
+      </w:pPr>
+    </w:p>
+    <w:p>
+      <w:pPr>
+        <w:rPr>
+          <w:rFonts w:ascii="Arial" w:hAnsi="Arial" w:cs="Arial"/>
+          <w:i/>
+          <w:iCs/>
+          <w:sz w:val="22"/>
+          <w:szCs w:val="22"/>
+        </w:rPr>
+      </w:pPr>
+      <w:r>
+        <w:rPr>
+          <w:rFonts w:ascii="Arial" w:hAnsi="Arial" w:cs="Arial"/>
+          <w:sz w:val="28"/>
+          <w:szCs w:val="28"/>
+        </w:rPr>
+        <w:t>Strava</w:t>
+      </w:r>
+      <w:r>
+        <w:rPr>
+          <w:rFonts w:ascii="Arial" w:hAnsi="Arial" w:cs="Arial"/>
+          <w:sz w:val="28"/>
+          <w:szCs w:val="28"/>
+        </w:rPr>
+        <w:t xml:space="preserve">, </w:t>
+      </w:r>
+      <w:r>
+        <w:rPr>
+          <w:rFonts w:ascii="Arial" w:hAnsi="Arial" w:cs="Arial"/>
+          <w:sz w:val="28"/>
+          <w:szCs w:val="28"/>
+        </w:rPr>
+        <w:t>Inc. (</w:t>
+      </w:r>
+      <w:r>
+        <w:rPr>
+          <w:rFonts w:ascii="Arial" w:hAnsi="Arial" w:cs="Arial"/>
+          <w:sz w:val="28"/>
+          <w:szCs w:val="28"/>
+        </w:rPr>
+        <w:t>20</w:t>
+      </w:r>
+      <w:r>
+        <w:rPr>
+          <w:rFonts w:ascii="Arial" w:hAnsi="Arial" w:cs="Arial"/>
+          <w:sz w:val="28"/>
+          <w:szCs w:val="28"/>
+        </w:rPr>
+        <w:t>25</w:t>
+      </w:r>
+      <w:r>
+        <w:rPr>
+          <w:rFonts w:ascii="Arial" w:hAnsi="Arial" w:cs="Arial"/>
+          <w:sz w:val="28"/>
+          <w:szCs w:val="28"/>
+        </w:rPr>
+        <w:t>, Sept 11</w:t>
+      </w:r>
+      <w:r>
+        <w:rPr>
+          <w:rFonts w:ascii="Arial" w:hAnsi="Arial" w:cs="Arial"/>
+          <w:sz w:val="28"/>
+          <w:szCs w:val="28"/>
+        </w:rPr>
+        <w:t>)</w:t>
+      </w:r>
+      <w:r>
+        <w:rPr>
+          <w:rFonts w:ascii="Arial" w:hAnsi="Arial" w:cs="Arial"/>
+          <w:sz w:val="28"/>
+          <w:szCs w:val="28"/>
+        </w:rPr>
+        <w:t>.</w:t>
+      </w:r>
+      <w:r>
+        <w:rPr>
+          <w:rFonts w:ascii="Arial" w:hAnsi="Arial" w:cs="Arial"/>
+          <w:sz w:val="28"/>
+          <w:szCs w:val="28"/>
+        </w:rPr>
+        <w:t xml:space="preserve"> </w:t>
+      </w:r>
+      <w:r>
+        <w:rPr>
+          <w:rFonts w:ascii="Arial" w:hAnsi="Arial" w:cs="Arial"/>
+          <w:b/>
+          <w:bCs/>
+          <w:i/>
+          <w:iCs/>
+          <w:sz w:val="28"/>
+          <w:szCs w:val="28"/>
+        </w:rPr>
+        <w:t>Strava</w:t>
+      </w:r>
+      <w:r>
+        <w:rPr>
+          <w:rFonts w:ascii="Arial" w:hAnsi="Arial" w:cs="Arial"/>
+          <w:sz w:val="28"/>
+          <w:szCs w:val="28"/>
+        </w:rPr>
+        <w:t xml:space="preserve"> </w:t>
+      </w:r>
+      <w:r>
+        <w:rPr>
+          <w:rFonts w:ascii="Arial" w:hAnsi="Arial" w:cs="Arial"/>
+          <w:sz w:val="28"/>
+          <w:szCs w:val="28"/>
+        </w:rPr>
+        <w:t>(Version</w:t>
+      </w:r>
+      <w:r>
+        <w:rPr>
+          <w:rFonts w:ascii="Arial" w:hAnsi="Arial" w:cs="Arial"/>
+          <w:sz w:val="28"/>
+          <w:szCs w:val="28"/>
+        </w:rPr>
+        <w:t xml:space="preserve"> </w:t>
+      </w:r>
+      <w:r>
+        <w:rPr>
+          <w:rFonts w:ascii="Arial" w:hAnsi="Arial" w:cs="Arial"/>
+          <w:sz w:val="28"/>
+          <w:szCs w:val="28"/>
+        </w:rPr>
+        <w:t>428.0.1</w:t>
+      </w:r>
+      <w:r>
+        <w:rPr>
+          <w:rFonts w:ascii="Arial" w:hAnsi="Arial" w:cs="Arial"/>
+          <w:sz w:val="28"/>
+          <w:szCs w:val="28"/>
+        </w:rPr>
+        <w:t>)</w:t>
+      </w:r>
+      <w:r>
+        <w:rPr>
+          <w:rFonts w:ascii="Arial" w:hAnsi="Arial" w:cs="Arial"/>
+          <w:sz w:val="28"/>
+          <w:szCs w:val="28"/>
+        </w:rPr>
+        <w:t xml:space="preserve"> </w:t>
+      </w:r>
+      <w:r>
+        <w:rPr>
+          <w:rFonts w:ascii="Arial" w:hAnsi="Arial" w:cs="Arial"/>
+          <w:i/>
+          <w:iCs/>
+          <w:sz w:val="22"/>
+          <w:szCs w:val="22"/>
+        </w:rPr>
+        <w:t>[</w:t>
+      </w:r>
+      <w:r>
+        <w:rPr>
+          <w:rFonts w:ascii="Arial" w:hAnsi="Arial" w:cs="Arial"/>
+          <w:i/>
+          <w:iCs/>
+          <w:sz w:val="22"/>
+          <w:szCs w:val="22"/>
+        </w:rPr>
+        <w:t xml:space="preserve">Website and </w:t>
+      </w:r>
+      <w:r>
+        <w:rPr>
+          <w:rFonts w:ascii="Arial" w:hAnsi="Arial" w:cs="Arial"/>
+          <w:i/>
+          <w:iCs/>
+          <w:sz w:val="22"/>
+          <w:szCs w:val="22"/>
+        </w:rPr>
+        <w:t xml:space="preserve">Mobile </w:t>
+      </w:r>
+      <w:r>
+        <w:rPr>
+          <w:rFonts w:ascii="Arial" w:hAnsi="Arial" w:cs="Arial"/>
+          <w:i/>
+          <w:iCs/>
+          <w:sz w:val="22"/>
+          <w:szCs w:val="22"/>
+        </w:rPr>
+        <w:t>A</w:t>
+      </w:r>
+      <w:r>
+        <w:rPr>
+          <w:rFonts w:ascii="Arial" w:hAnsi="Arial" w:cs="Arial"/>
+          <w:i/>
+          <w:iCs/>
+          <w:sz w:val="22"/>
+          <w:szCs w:val="22"/>
+        </w:rPr>
+        <w:t>pp]</w:t>
+      </w:r>
+    </w:p>
+    <w:p>
+      <w:pPr>
+        <w:ind w:firstLine="720"/>
+        <w:rPr>
+          <w:rFonts w:ascii="Arial" w:hAnsi="Arial" w:cs="Arial"/>
+          <w:sz w:val="28"/>
+          <w:szCs w:val="28"/>
+        </w:rPr>
+      </w:pPr>
+      <w:hyperlink r:id="rId9" w:history="1">
+        <w:r>
+          <w:rPr>
+            <w:rStyle w:val="Hyperlink"/>
+            <w:rFonts w:ascii="Arial" w:hAnsi="Arial" w:cs="Arial"/>
+            <w:sz w:val="28"/>
+            <w:szCs w:val="28"/>
+          </w:rPr>
+          <w:t>https://www.strava.com</w:t>
+        </w:r>
+      </w:hyperlink>
+      <w:r>
+        <w:rPr>
+          <w:rFonts w:ascii="Arial" w:hAnsi="Arial" w:cs="Arial"/>
+          <w:sz w:val="28"/>
+          <w:szCs w:val="28"/>
+        </w:rPr>
+        <w:tab/>
       </w:r>
     </w:p>
     <w:p>
@@ -1303,6 +1747,56 @@
 </w:document>
 </file>
 
+<file path=word/endnotes.xml><?xml version="1.0" encoding="utf-8"?>
+<w:endnotes xmlns:wpc="http://schemas.microsoft.com/office/word/2010/wordprocessingCanvas" xmlns:cx="http://schemas.microsoft.com/office/drawing/2014/chartex" xmlns:cx1="http://schemas.microsoft.com/office/drawing/2015/9/8/chartex" xmlns:cx2="http://schemas.microsoft.com/office/drawing/2015/10/21/chartex" xmlns:cx3="http://schemas.microsoft.com/office/drawing/2016/5/9/chartex" xmlns:cx4="http://schemas.microsoft.com/office/drawing/2016/5/10/chartex" xmlns:cx5="http://schemas.microsoft.com/office/drawing/2016/5/11/chartex" xmlns:cx6="http://schemas.microsoft.com/office/drawing/2016/5/12/chartex" xmlns:cx7="http://schemas.microsoft.com/office/drawing/2016/5/13/chartex" xmlns:cx8="http://schemas.microsoft.com/office/drawing/2016/5/14/chartex" xmlns:mc="http://schemas.openxmlformats.org/markup-compatibility/2006" xmlns:aink="http://schemas.microsoft.com/office/drawing/2016/ink" xmlns:am3d="http://schemas.microsoft.com/office/drawing/2017/model3d" xmlns:o="urn:schemas-microsoft-com:office:office" xmlns:oel="http://schemas.microsoft.com/office/2019/extlst" xmlns:r="http://schemas.openxmlformats.org/officeDocument/2006/relationships" xmlns:m="http://schemas.openxmlformats.org/officeDocument/2006/math" xmlns:v="urn:schemas-microsoft-com:vml" xmlns:wp14="http://schemas.microsoft.com/office/word/2010/wordprocessingDrawing" xmlns:wp="http://schemas.openxmlformats.org/drawingml/2006/wordprocessingDrawing" xmlns:w10="urn:schemas-microsoft-com:office:word" xmlns:w="http://schemas.openxmlformats.org/wordprocessingml/2006/main" xmlns:w14="http://schemas.microsoft.com/office/word/2010/wordml" xmlns:w15="http://schemas.microsoft.com/office/word/2012/wordml" xmlns:w16cex="http://schemas.microsoft.com/office/word/2018/wordml/cex" xmlns:w16cid="http://schemas.microsoft.com/office/word/2016/wordml/cid" xmlns:w16="http://schemas.microsoft.com/office/word/2018/wordml" xmlns:w16du="http://schemas.microsoft.com/office/word/2023/wordml/word16du" xmlns:w16sdtdh="http://schemas.microsoft.com/office/word/2020/wordml/sdtdatahash" xmlns:w16sdtfl="http://schemas.microsoft.com/office/word/2024/wordml/sdtformatlock" xmlns:w16se="http://schemas.microsoft.com/office/word/2015/wordml/symex" xmlns:wpg="http://schemas.microsoft.com/office/word/2010/wordprocessingGroup" xmlns:wpi="http://schemas.microsoft.com/office/word/2010/wordprocessingInk" xmlns:wne="http://schemas.microsoft.com/office/word/2006/wordml" xmlns:wps="http://schemas.microsoft.com/office/word/2010/wordprocessingShape" mc:Ignorable="w14 w15 w16se w16cid w16 w16cex w16sdtdh w16sdtfl w16du wp14">
+  <w:endnote w:type="separator" w:id="-1">
+    <w:p>
+      <w:pPr>
+        <w:spacing w:after="0" w:line="240" w:lineRule="auto"/>
+      </w:pPr>
+      <w:r>
+        <w:separator/>
+      </w:r>
+    </w:p>
+  </w:endnote>
+  <w:endnote w:type="continuationSeparator" w:id="0">
+    <w:p>
+      <w:pPr>
+        <w:spacing w:after="0" w:line="240" w:lineRule="auto"/>
+      </w:pPr>
+      <w:r>
+        <w:continuationSeparator/>
+      </w:r>
+    </w:p>
+  </w:endnote>
+</w:endnotes>
+</file>
+
+<file path=word/footnotes.xml><?xml version="1.0" encoding="utf-8"?>
+<w:footnotes xmlns:wpc="http://schemas.microsoft.com/office/word/2010/wordprocessingCanvas" xmlns:cx="http://schemas.microsoft.com/office/drawing/2014/chartex" xmlns:cx1="http://schemas.microsoft.com/office/drawing/2015/9/8/chartex" xmlns:cx2="http://schemas.microsoft.com/office/drawing/2015/10/21/chartex" xmlns:cx3="http://schemas.microsoft.com/office/drawing/2016/5/9/chartex" xmlns:cx4="http://schemas.microsoft.com/office/drawing/2016/5/10/chartex" xmlns:cx5="http://schemas.microsoft.com/office/drawing/2016/5/11/chartex" xmlns:cx6="http://schemas.microsoft.com/office/drawing/2016/5/12/chartex" xmlns:cx7="http://schemas.microsoft.com/office/drawing/2016/5/13/chartex" xmlns:cx8="http://schemas.microsoft.com/office/drawing/2016/5/14/chartex" xmlns:mc="http://schemas.openxmlformats.org/markup-compatibility/2006" xmlns:aink="http://schemas.microsoft.com/office/drawing/2016/ink" xmlns:am3d="http://schemas.microsoft.com/office/drawing/2017/model3d" xmlns:o="urn:schemas-microsoft-com:office:office" xmlns:oel="http://schemas.microsoft.com/office/2019/extlst" xmlns:r="http://schemas.openxmlformats.org/officeDocument/2006/relationships" xmlns:m="http://schemas.openxmlformats.org/officeDocument/2006/math" xmlns:v="urn:schemas-microsoft-com:vml" xmlns:wp14="http://schemas.microsoft.com/office/word/2010/wordprocessingDrawing" xmlns:wp="http://schemas.openxmlformats.org/drawingml/2006/wordprocessingDrawing" xmlns:w10="urn:schemas-microsoft-com:office:word" xmlns:w="http://schemas.openxmlformats.org/wordprocessingml/2006/main" xmlns:w14="http://schemas.microsoft.com/office/word/2010/wordml" xmlns:w15="http://schemas.microsoft.com/office/word/2012/wordml" xmlns:w16cex="http://schemas.microsoft.com/office/word/2018/wordml/cex" xmlns:w16cid="http://schemas.microsoft.com/office/word/2016/wordml/cid" xmlns:w16="http://schemas.microsoft.com/office/word/2018/wordml" xmlns:w16du="http://schemas.microsoft.com/office/word/2023/wordml/word16du" xmlns:w16sdtdh="http://schemas.microsoft.com/office/word/2020/wordml/sdtdatahash" xmlns:w16sdtfl="http://schemas.microsoft.com/office/word/2024/wordml/sdtformatlock" xmlns:w16se="http://schemas.microsoft.com/office/word/2015/wordml/symex" xmlns:wpg="http://schemas.microsoft.com/office/word/2010/wordprocessingGroup" xmlns:wpi="http://schemas.microsoft.com/office/word/2010/wordprocessingInk" xmlns:wne="http://schemas.microsoft.com/office/word/2006/wordml" xmlns:wps="http://schemas.microsoft.com/office/word/2010/wordprocessingShape" mc:Ignorable="w14 w15 w16se w16cid w16 w16cex w16sdtdh w16sdtfl w16du wp14">
+  <w:footnote w:type="separator" w:id="-1">
+    <w:p>
+      <w:pPr>
+        <w:spacing w:after="0" w:line="240" w:lineRule="auto"/>
+      </w:pPr>
+      <w:r>
+        <w:separator/>
+      </w:r>
+    </w:p>
+  </w:footnote>
+  <w:footnote w:type="continuationSeparator" w:id="0">
+    <w:p>
+      <w:pPr>
+        <w:spacing w:after="0" w:line="240" w:lineRule="auto"/>
+      </w:pPr>
+      <w:r>
+        <w:continuationSeparator/>
+      </w:r>
+    </w:p>
+  </w:footnote>
+</w:footnotes>
+</file>
+
 <file path=word/numbering.xml><?xml version="1.0" encoding="utf-8"?>
 <w:numbering xmlns:wpc="http://schemas.microsoft.com/office/word/2010/wordprocessingCanvas" xmlns:cx="http://schemas.microsoft.com/office/drawing/2014/chartex" xmlns:cx1="http://schemas.microsoft.com/office/drawing/2015/9/8/chartex" xmlns:cx2="http://schemas.microsoft.com/office/drawing/2015/10/21/chartex" xmlns:cx3="http://schemas.microsoft.com/office/drawing/2016/5/9/chartex" xmlns:cx4="http://schemas.microsoft.com/office/drawing/2016/5/10/chartex" xmlns:cx5="http://schemas.microsoft.com/office/drawing/2016/5/11/chartex" xmlns:cx6="http://schemas.microsoft.com/office/drawing/2016/5/12/chartex" xmlns:cx7="http://schemas.microsoft.com/office/drawing/2016/5/13/chartex" xmlns:cx8="http://schemas.microsoft.com/office/drawing/2016/5/14/chartex" xmlns:mc="http://schemas.openxmlformats.org/markup-compatibility/2006" xmlns:aink="http://schemas.microsoft.com/office/drawing/2016/ink" xmlns:am3d="http://schemas.microsoft.com/office/drawing/2017/model3d" xmlns:o="urn:schemas-microsoft-com:office:office" xmlns:oel="http://schemas.microsoft.com/office/2019/extlst" xmlns:r="http://schemas.openxmlformats.org/officeDocument/2006/relationships" xmlns:m="http://schemas.openxmlformats.org/officeDocument/2006/math" xmlns:v="urn:schemas-microsoft-com:vml" xmlns:wp14="http://schemas.microsoft.com/office/word/2010/wordprocessingDrawing" xmlns:wp="http://schemas.openxmlformats.org/drawingml/2006/wordprocessingDrawing" xmlns:w10="urn:schemas-microsoft-com:office:word" xmlns:w="http://schemas.openxmlformats.org/wordprocessingml/2006/main" xmlns:w14="http://schemas.microsoft.com/office/word/2010/wordml" xmlns:w15="http://schemas.microsoft.com/office/word/2012/wordml" xmlns:w16cex="http://schemas.microsoft.com/office/word/2018/wordml/cex" xmlns:w16cid="http://schemas.microsoft.com/office/word/2016/wordml/cid" xmlns:w16="http://schemas.microsoft.com/office/word/2018/wordml" xmlns:w16du="http://schemas.microsoft.com/office/word/2023/wordml/word16du" xmlns:w16sdtdh="http://schemas.microsoft.com/office/word/2020/wordml/sdtdatahash" xmlns:w16sdtfl="http://schemas.microsoft.com/office/word/2024/wordml/sdtformatlock" xmlns:w16se="http://schemas.microsoft.com/office/word/2015/wordml/symex" xmlns:wpg="http://schemas.microsoft.com/office/word/2010/wordprocessingGroup" xmlns:wpi="http://schemas.microsoft.com/office/word/2010/wordprocessingInk" xmlns:wne="http://schemas.microsoft.com/office/word/2006/wordml" xmlns:wps="http://schemas.microsoft.com/office/word/2010/wordprocessingShape" mc:Ignorable="w14 w15 w16se w16cid w16 w16cex w16sdtdh w16sdtfl w16du wp14">
   <w:abstractNum w:abstractNumId="0" w15:restartNumberingAfterBreak="0">
@@ -1398,6 +1892,155 @@
     </w:lvl>
   </w:abstractNum>
   <w:abstractNum w:abstractNumId="1" w15:restartNumberingAfterBreak="0">
+    <w:nsid w:val="67462FE9"/>
+    <w:multiLevelType w:val="multilevel"/>
+    <w:tmpl w:val="97C01740"/>
+    <w:lvl w:ilvl="0">
+      <w:start w:val="1"/>
+      <w:numFmt w:val="bullet"/>
+      <w:lvlText w:val=""/>
+      <w:lvlJc w:val="left"/>
+      <w:pPr>
+        <w:tabs>
+          <w:tab w:val="num" w:pos="720"/>
+        </w:tabs>
+        <w:ind w:left="720" w:hanging="360"/>
+      </w:pPr>
+      <w:rPr>
+        <w:rFonts w:ascii="Symbol" w:hAnsi="Symbol" w:hint="default"/>
+        <w:sz w:val="20"/>
+      </w:rPr>
+    </w:lvl>
+    <w:lvl w:ilvl="1" w:tentative="1">
+      <w:start w:val="1"/>
+      <w:numFmt w:val="bullet"/>
+      <w:lvlText w:val="o"/>
+      <w:lvlJc w:val="left"/>
+      <w:pPr>
+        <w:tabs>
+          <w:tab w:val="num" w:pos="1440"/>
+        </w:tabs>
+        <w:ind w:left="1440" w:hanging="360"/>
+      </w:pPr>
+      <w:rPr>
+        <w:rFonts w:ascii="Courier New" w:hAnsi="Courier New" w:hint="default"/>
+        <w:sz w:val="20"/>
+      </w:rPr>
+    </w:lvl>
+    <w:lvl w:ilvl="2" w:tentative="1">
+      <w:start w:val="1"/>
+      <w:numFmt w:val="bullet"/>
+      <w:lvlText w:val=""/>
+      <w:lvlJc w:val="left"/>
+      <w:pPr>
+        <w:tabs>
+          <w:tab w:val="num" w:pos="2160"/>
+        </w:tabs>
+        <w:ind w:left="2160" w:hanging="360"/>
+      </w:pPr>
+      <w:rPr>
+        <w:rFonts w:ascii="Wingdings" w:hAnsi="Wingdings" w:hint="default"/>
+        <w:sz w:val="20"/>
+      </w:rPr>
+    </w:lvl>
+    <w:lvl w:ilvl="3" w:tentative="1">
+      <w:start w:val="1"/>
+      <w:numFmt w:val="bullet"/>
+      <w:lvlText w:val=""/>
+      <w:lvlJc w:val="left"/>
+      <w:pPr>
+        <w:tabs>
+          <w:tab w:val="num" w:pos="2880"/>
+        </w:tabs>
+        <w:ind w:left="2880" w:hanging="360"/>
+      </w:pPr>
+      <w:rPr>
+        <w:rFonts w:ascii="Wingdings" w:hAnsi="Wingdings" w:hint="default"/>
+        <w:sz w:val="20"/>
+      </w:rPr>
+    </w:lvl>
+    <w:lvl w:ilvl="4" w:tentative="1">
+      <w:start w:val="1"/>
+      <w:numFmt w:val="bullet"/>
+      <w:lvlText w:val=""/>
+      <w:lvlJc w:val="left"/>
+      <w:pPr>
+        <w:tabs>
+          <w:tab w:val="num" w:pos="3600"/>
+        </w:tabs>
+        <w:ind w:left="3600" w:hanging="360"/>
+      </w:pPr>
+      <w:rPr>
+        <w:rFonts w:ascii="Wingdings" w:hAnsi="Wingdings" w:hint="default"/>
+        <w:sz w:val="20"/>
+      </w:rPr>
+    </w:lvl>
+    <w:lvl w:ilvl="5" w:tentative="1">
+      <w:start w:val="1"/>
+      <w:numFmt w:val="bullet"/>
+      <w:lvlText w:val=""/>
+      <w:lvlJc w:val="left"/>
+      <w:pPr>
+        <w:tabs>
+          <w:tab w:val="num" w:pos="4320"/>
+        </w:tabs>
+        <w:ind w:left="4320" w:hanging="360"/>
+      </w:pPr>
+      <w:rPr>
+        <w:rFonts w:ascii="Wingdings" w:hAnsi="Wingdings" w:hint="default"/>
+        <w:sz w:val="20"/>
+      </w:rPr>
+    </w:lvl>
+    <w:lvl w:ilvl="6" w:tentative="1">
+      <w:start w:val="1"/>
+      <w:numFmt w:val="bullet"/>
+      <w:lvlText w:val=""/>
+      <w:lvlJc w:val="left"/>
+      <w:pPr>
+        <w:tabs>
+          <w:tab w:val="num" w:pos="5040"/>
+        </w:tabs>
+        <w:ind w:left="5040" w:hanging="360"/>
+      </w:pPr>
+      <w:rPr>
+        <w:rFonts w:ascii="Wingdings" w:hAnsi="Wingdings" w:hint="default"/>
+        <w:sz w:val="20"/>
+      </w:rPr>
+    </w:lvl>
+    <w:lvl w:ilvl="7" w:tentative="1">
+      <w:start w:val="1"/>
+      <w:numFmt w:val="bullet"/>
+      <w:lvlText w:val=""/>
+      <w:lvlJc w:val="left"/>
+      <w:pPr>
+        <w:tabs>
+          <w:tab w:val="num" w:pos="5760"/>
+        </w:tabs>
+        <w:ind w:left="5760" w:hanging="360"/>
+      </w:pPr>
+      <w:rPr>
+        <w:rFonts w:ascii="Wingdings" w:hAnsi="Wingdings" w:hint="default"/>
+        <w:sz w:val="20"/>
+      </w:rPr>
+    </w:lvl>
+    <w:lvl w:ilvl="8" w:tentative="1">
+      <w:start w:val="1"/>
+      <w:numFmt w:val="bullet"/>
+      <w:lvlText w:val=""/>
+      <w:lvlJc w:val="left"/>
+      <w:pPr>
+        <w:tabs>
+          <w:tab w:val="num" w:pos="6480"/>
+        </w:tabs>
+        <w:ind w:left="6480" w:hanging="360"/>
+      </w:pPr>
+      <w:rPr>
+        <w:rFonts w:ascii="Wingdings" w:hAnsi="Wingdings" w:hint="default"/>
+        <w:sz w:val="20"/>
+      </w:rPr>
+    </w:lvl>
+  </w:abstractNum>
+  <w:abstractNum w:abstractNumId="2" w15:restartNumberingAfterBreak="0">
     <w:nsid w:val="6C327E73"/>
     <w:multiLevelType w:val="hybridMultilevel"/>
     <w:tmpl w:val="C4EE9AAC"/>
@@ -1510,7 +2153,7 @@
       </w:rPr>
     </w:lvl>
   </w:abstractNum>
-  <w:abstractNum w:abstractNumId="2" w15:restartNumberingAfterBreak="0">
+  <w:abstractNum w:abstractNumId="3" w15:restartNumberingAfterBreak="0">
     <w:nsid w:val="6E2D0F69"/>
     <w:multiLevelType w:val="hybridMultilevel"/>
     <w:tmpl w:val="037641EC"/>
@@ -1600,12 +2243,15 @@
     </w:lvl>
   </w:abstractNum>
   <w:num w:numId="1" w16cid:durableId="526409774">
-    <w:abstractNumId w:val="2"/>
+    <w:abstractNumId w:val="3"/>
   </w:num>
   <w:num w:numId="2" w16cid:durableId="304509475">
     <w:abstractNumId w:val="0"/>
   </w:num>
   <w:num w:numId="3" w16cid:durableId="695809430">
+    <w:abstractNumId w:val="2"/>
+  </w:num>
+  <w:num w:numId="4" w16cid:durableId="852376347">
     <w:abstractNumId w:val="1"/>
   </w:num>
 </w:numbering>
@@ -2215,7 +2861,6 @@
   <w:style w:type="character" w:default="1" w:styleId="DefaultParagraphFont">
     <w:name w:val="Default Paragraph Font"/>
     <w:uiPriority w:val="1"/>
-    <w:semiHidden/>
     <w:unhideWhenUsed/>
   </w:style>
   <w:style w:type="table" w:default="1" w:styleId="TableNormal">
@@ -2558,6 +3203,73 @@
       <w:sz w:val="22"/>
       <w:szCs w:val="22"/>
       <w14:ligatures w14:val="none"/>
+    </w:rPr>
+  </w:style>
+  <w:style w:type="paragraph" w:styleId="Header">
+    <w:name w:val="header"/>
+    <w:basedOn w:val="Normal"/>
+    <w:link w:val="HeaderChar"/>
+    <w:uiPriority w:val="99"/>
+    <w:unhideWhenUsed/>
+    <w:rsid w:val="001C57EB"/>
+    <w:pPr>
+      <w:tabs>
+        <w:tab w:val="center" w:pos="4680"/>
+        <w:tab w:val="right" w:pos="9360"/>
+      </w:tabs>
+      <w:spacing w:after="0" w:line="240" w:lineRule="auto"/>
+    </w:pPr>
+  </w:style>
+  <w:style w:type="character" w:customStyle="1" w:styleId="HeaderChar">
+    <w:name w:val="Header Char"/>
+    <w:basedOn w:val="DefaultParagraphFont"/>
+    <w:link w:val="Header"/>
+    <w:uiPriority w:val="99"/>
+    <w:rsid w:val="001C57EB"/>
+  </w:style>
+  <w:style w:type="paragraph" w:styleId="Footer">
+    <w:name w:val="footer"/>
+    <w:basedOn w:val="Normal"/>
+    <w:link w:val="FooterChar"/>
+    <w:uiPriority w:val="99"/>
+    <w:unhideWhenUsed/>
+    <w:rsid w:val="001C57EB"/>
+    <w:pPr>
+      <w:tabs>
+        <w:tab w:val="center" w:pos="4680"/>
+        <w:tab w:val="right" w:pos="9360"/>
+      </w:tabs>
+      <w:spacing w:after="0" w:line="240" w:lineRule="auto"/>
+    </w:pPr>
+  </w:style>
+  <w:style w:type="character" w:customStyle="1" w:styleId="FooterChar">
+    <w:name w:val="Footer Char"/>
+    <w:basedOn w:val="DefaultParagraphFont"/>
+    <w:link w:val="Footer"/>
+    <w:uiPriority w:val="99"/>
+    <w:rsid w:val="001C57EB"/>
+  </w:style>
+  <w:style w:type="character" w:styleId="Hyperlink">
+    <w:name w:val="Hyperlink"/>
+    <w:basedOn w:val="DefaultParagraphFont"/>
+    <w:uiPriority w:val="99"/>
+    <w:unhideWhenUsed/>
+    <w:rsid w:val="00B401A3"/>
+    <w:rPr>
+      <w:color w:val="467886" w:themeColor="hyperlink"/>
+      <w:u w:val="single"/>
+    </w:rPr>
+  </w:style>
+  <w:style w:type="character" w:styleId="UnresolvedMention">
+    <w:name w:val="Unresolved Mention"/>
+    <w:basedOn w:val="DefaultParagraphFont"/>
+    <w:uiPriority w:val="99"/>
+    <w:semiHidden/>
+    <w:unhideWhenUsed/>
+    <w:rsid w:val="00B401A3"/>
+    <w:rPr>
+      <w:color w:val="605E5C"/>
+      <w:shd w:val="clear" w:color="auto" w:fill="E1DFDD"/>
     </w:rPr>
   </w:style>
 </w:styles>

</xml_diff>